<commit_message>
Documentation for added buoys from 2019-2024
</commit_message>
<xml_diff>
--- a/SIMB3_documentation.docx
+++ b/SIMB3_documentation.docx
@@ -36,14 +36,28 @@
           <w:rFonts w:ascii="Atkinson Hyperlegible" w:hAnsi="Atkinson Hyperlegible"/>
           <w:b/>
         </w:rPr>
-        <w:t>SIMB3</w:t>
+        <w:t>CRREL</w:t>
       </w:r>
       <w:r>
         <w:rPr>
           <w:rFonts w:ascii="Atkinson Hyperlegible" w:hAnsi="Atkinson Hyperlegible"/>
           <w:b/>
         </w:rPr>
-        <w:t xml:space="preserve"> ice mass balance buoys</w:t>
+        <w:t xml:space="preserve"> ice mass balance</w:t>
+      </w:r>
+      <w:r>
+        <w:rPr>
+          <w:rFonts w:ascii="Atkinson Hyperlegible" w:hAnsi="Atkinson Hyperlegible"/>
+          <w:b/>
+        </w:rPr>
+        <w:t xml:space="preserve"> (IMB)</w:t>
+      </w:r>
+      <w:r>
+        <w:rPr>
+          <w:rFonts w:ascii="Atkinson Hyperlegible" w:hAnsi="Atkinson Hyperlegible"/>
+          <w:b/>
+        </w:rPr>
+        <w:t xml:space="preserve"> buoys</w:t>
       </w:r>
     </w:p>
     <w:p>
@@ -63,7 +77,7 @@
         <w:rPr>
           <w:rFonts w:ascii="Atkinson Hyperlegible" w:hAnsi="Atkinson Hyperlegible"/>
         </w:rPr>
-        <w:t>1</w:t>
+        <w:t>2</w:t>
       </w:r>
     </w:p>
     <w:p>
@@ -89,13 +103,25 @@
         <w:rPr>
           <w:rFonts w:ascii="Atkinson Hyperlegible" w:hAnsi="Atkinson Hyperlegible"/>
         </w:rPr>
-        <w:t xml:space="preserve">25 </w:t>
-      </w:r>
-      <w:r>
-        <w:rPr>
-          <w:rFonts w:ascii="Atkinson Hyperlegible" w:hAnsi="Atkinson Hyperlegible"/>
-        </w:rPr>
-        <w:t>February 202</w:t>
+        <w:t>19</w:t>
+      </w:r>
+      <w:r>
+        <w:rPr>
+          <w:rFonts w:ascii="Atkinson Hyperlegible" w:hAnsi="Atkinson Hyperlegible"/>
+        </w:rPr>
+        <w:t xml:space="preserve"> </w:t>
+      </w:r>
+      <w:r>
+        <w:rPr>
+          <w:rFonts w:ascii="Atkinson Hyperlegible" w:hAnsi="Atkinson Hyperlegible"/>
+        </w:rPr>
+        <w:t>March</w:t>
+      </w:r>
+      <w:r>
+        <w:rPr>
+          <w:rFonts w:ascii="Atkinson Hyperlegible" w:hAnsi="Atkinson Hyperlegible"/>
+        </w:rPr>
+        <w:t xml:space="preserve"> 202</w:t>
       </w:r>
       <w:r>
         <w:rPr>
@@ -135,7 +161,19 @@
         <w:rPr>
           <w:rFonts w:ascii="Atkinson Hyperlegible" w:hAnsi="Atkinson Hyperlegible"/>
         </w:rPr>
-        <w:t>This dataset is based on the measurements from SIMB3 ice mass balance buoys deployed in the Arctic Ocean during 1997</w:t>
+        <w:t xml:space="preserve">This dataset is based on the measurements from </w:t>
+      </w:r>
+      <w:r>
+        <w:rPr>
+          <w:rFonts w:ascii="Atkinson Hyperlegible" w:hAnsi="Atkinson Hyperlegible"/>
+        </w:rPr>
+        <w:t>CRREL</w:t>
+      </w:r>
+      <w:r>
+        <w:rPr>
+          <w:rFonts w:ascii="Atkinson Hyperlegible" w:hAnsi="Atkinson Hyperlegible"/>
+        </w:rPr>
+        <w:t xml:space="preserve"> ice mass balance buoys deployed in the Arctic Ocean during 1997</w:t>
       </w:r>
       <w:r>
         <w:rPr>
@@ -147,13 +185,73 @@
         <w:rPr>
           <w:rFonts w:ascii="Atkinson Hyperlegible" w:hAnsi="Atkinson Hyperlegible"/>
         </w:rPr>
-        <w:t xml:space="preserve">2015. </w:t>
-      </w:r>
-      <w:r>
-        <w:rPr>
-          <w:rFonts w:ascii="Atkinson Hyperlegible" w:hAnsi="Atkinson Hyperlegible"/>
-        </w:rPr>
-        <w:t xml:space="preserve">These buoys measure ice surface and bottom elevation via two separate acoustic sounders and in-situ temperature of air, snow, ice, and water via a chain of thermistors with 10 cm vertical spacing. The original data is published at </w:t>
+        <w:t>2015</w:t>
+      </w:r>
+      <w:r>
+        <w:rPr>
+          <w:rFonts w:ascii="Atkinson Hyperlegible" w:hAnsi="Atkinson Hyperlegible"/>
+        </w:rPr>
+        <w:t xml:space="preserve"> and during 2019</w:t>
+      </w:r>
+      <w:r>
+        <w:rPr>
+          <w:rFonts w:ascii="Atkinson Hyperlegible" w:hAnsi="Atkinson Hyperlegible"/>
+        </w:rPr>
+        <w:t>–</w:t>
+      </w:r>
+      <w:r>
+        <w:rPr>
+          <w:rFonts w:ascii="Atkinson Hyperlegible" w:hAnsi="Atkinson Hyperlegible"/>
+        </w:rPr>
+        <w:t>2024</w:t>
+      </w:r>
+      <w:r>
+        <w:rPr>
+          <w:rFonts w:ascii="Atkinson Hyperlegible" w:hAnsi="Atkinson Hyperlegible"/>
+        </w:rPr>
+        <w:t xml:space="preserve">. </w:t>
+      </w:r>
+      <w:r>
+        <w:rPr>
+          <w:rFonts w:ascii="Atkinson Hyperlegible" w:hAnsi="Atkinson Hyperlegible"/>
+        </w:rPr>
+        <w:t>B</w:t>
+      </w:r>
+      <w:r>
+        <w:rPr>
+          <w:rFonts w:ascii="Atkinson Hyperlegible" w:hAnsi="Atkinson Hyperlegible"/>
+        </w:rPr>
+        <w:t xml:space="preserve">uoys </w:t>
+      </w:r>
+      <w:r>
+        <w:rPr>
+          <w:rFonts w:ascii="Atkinson Hyperlegible" w:hAnsi="Atkinson Hyperlegible"/>
+        </w:rPr>
+        <w:t xml:space="preserve">deployed in </w:t>
+      </w:r>
+      <w:r>
+        <w:rPr>
+          <w:rFonts w:ascii="Atkinson Hyperlegible" w:hAnsi="Atkinson Hyperlegible"/>
+        </w:rPr>
+        <w:t>1997</w:t>
+      </w:r>
+      <w:r>
+        <w:rPr>
+          <w:rFonts w:ascii="Atkinson Hyperlegible" w:hAnsi="Atkinson Hyperlegible"/>
+        </w:rPr>
+        <w:t>–</w:t>
+      </w:r>
+      <w:r>
+        <w:rPr>
+          <w:rFonts w:ascii="Atkinson Hyperlegible" w:hAnsi="Atkinson Hyperlegible"/>
+        </w:rPr>
+        <w:t xml:space="preserve">2015 </w:t>
+      </w:r>
+      <w:r>
+        <w:rPr>
+          <w:rFonts w:ascii="Atkinson Hyperlegible" w:hAnsi="Atkinson Hyperlegible"/>
+        </w:rPr>
+        <w:t xml:space="preserve">measure ice surface and bottom elevation via two separate acoustic sounders and in-situ temperature of air, snow, ice, and water via a chain of thermistors with 10 cm vertical spacing. The original data is published at </w:t>
       </w:r>
       <w:hyperlink r:id="rId5" w:history="1">
         <w:r>
@@ -194,6 +292,84 @@
         </w:rPr>
         <w:t>). Here we describe the reprocessed dataset from West (2020).</w:t>
       </w:r>
+      <w:r>
+        <w:rPr>
+          <w:rFonts w:ascii="Atkinson Hyperlegible" w:hAnsi="Atkinson Hyperlegible"/>
+        </w:rPr>
+        <w:t xml:space="preserve"> </w:t>
+      </w:r>
+      <w:r>
+        <w:rPr>
+          <w:rFonts w:ascii="Atkinson Hyperlegible" w:hAnsi="Atkinson Hyperlegible"/>
+        </w:rPr>
+        <w:t>Buoys deployed in 2019</w:t>
+      </w:r>
+      <w:r>
+        <w:rPr>
+          <w:rFonts w:ascii="Atkinson Hyperlegible" w:hAnsi="Atkinson Hyperlegible"/>
+        </w:rPr>
+        <w:t>–</w:t>
+      </w:r>
+      <w:r>
+        <w:rPr>
+          <w:rFonts w:ascii="Atkinson Hyperlegible" w:hAnsi="Atkinson Hyperlegible"/>
+        </w:rPr>
+        <w:t>2024</w:t>
+      </w:r>
+      <w:r>
+        <w:rPr>
+          <w:rFonts w:ascii="Atkinson Hyperlegible" w:hAnsi="Atkinson Hyperlegible"/>
+        </w:rPr>
+        <w:t xml:space="preserve"> </w:t>
+      </w:r>
+      <w:r>
+        <w:rPr>
+          <w:rFonts w:ascii="Atkinson Hyperlegible" w:hAnsi="Atkinson Hyperlegible"/>
+        </w:rPr>
+        <w:t xml:space="preserve">measure ice surface and bottom elevation via two separate acoustic sounders and in-situ temperature of air, snow, ice, and water via a chain of thermistors with </w:t>
+      </w:r>
+      <w:r>
+        <w:rPr>
+          <w:rFonts w:ascii="Atkinson Hyperlegible" w:hAnsi="Atkinson Hyperlegible"/>
+        </w:rPr>
+        <w:t>2</w:t>
+      </w:r>
+      <w:r>
+        <w:rPr>
+          <w:rFonts w:ascii="Atkinson Hyperlegible" w:hAnsi="Atkinson Hyperlegible"/>
+        </w:rPr>
+        <w:t> cm vertical spacing.</w:t>
+      </w:r>
+      <w:r>
+        <w:rPr>
+          <w:rFonts w:ascii="Atkinson Hyperlegible" w:hAnsi="Atkinson Hyperlegible"/>
+        </w:rPr>
+        <w:t xml:space="preserve"> </w:t>
+      </w:r>
+      <w:r>
+        <w:rPr>
+          <w:rFonts w:ascii="Atkinson Hyperlegible" w:hAnsi="Atkinson Hyperlegible"/>
+        </w:rPr>
+        <w:t>The original data is published at</w:t>
+      </w:r>
+      <w:r>
+        <w:t xml:space="preserve"> </w:t>
+      </w:r>
+      <w:hyperlink r:id="rId6" w:history="1">
+        <w:r>
+          <w:rPr>
+            <w:rStyle w:val="Hyperlink"/>
+            <w:rFonts w:ascii="Atkinson Hyperlegible" w:hAnsi="Atkinson Hyperlegible"/>
+          </w:rPr>
+          <w:t>https://www.cryosphereinnovation.com/data</w:t>
+        </w:r>
+      </w:hyperlink>
+      <w:r>
+        <w:rPr>
+          <w:rFonts w:ascii="Atkinson Hyperlegible" w:hAnsi="Atkinson Hyperlegible"/>
+        </w:rPr>
+        <w:t>.</w:t>
+      </w:r>
     </w:p>
     <w:p>
       <w:pPr>
@@ -232,7 +408,37 @@
         <w:rPr>
           <w:rFonts w:ascii="Atkinson Hyperlegible" w:hAnsi="Atkinson Hyperlegible"/>
         </w:rPr>
-        <w:t xml:space="preserve">original dataset from West (2020) includes estimates of snow and ice thicknesses from 99 SIMB3 buoys. The estimates are based on the measurements of surface and bottom interface temporal evolution from two acoustic sounders together with manual measurements of the initial ice and snow thickness. </w:t>
+        <w:t>original dataset from West (2020) includes estimates of snow and ice thicknesses from 99 SIMB3 buoys</w:t>
+      </w:r>
+      <w:r>
+        <w:rPr>
+          <w:rFonts w:ascii="Atkinson Hyperlegible" w:hAnsi="Atkinson Hyperlegible"/>
+        </w:rPr>
+        <w:t xml:space="preserve"> deployed </w:t>
+      </w:r>
+      <w:r>
+        <w:rPr>
+          <w:rFonts w:ascii="Atkinson Hyperlegible" w:hAnsi="Atkinson Hyperlegible"/>
+        </w:rPr>
+        <w:t>during 1997</w:t>
+      </w:r>
+      <w:r>
+        <w:rPr>
+          <w:rFonts w:ascii="Atkinson Hyperlegible" w:hAnsi="Atkinson Hyperlegible"/>
+        </w:rPr>
+        <w:t>–</w:t>
+      </w:r>
+      <w:r>
+        <w:rPr>
+          <w:rFonts w:ascii="Atkinson Hyperlegible" w:hAnsi="Atkinson Hyperlegible"/>
+        </w:rPr>
+        <w:t>2015</w:t>
+      </w:r>
+      <w:r>
+        <w:rPr>
+          <w:rFonts w:ascii="Atkinson Hyperlegible" w:hAnsi="Atkinson Hyperlegible"/>
+        </w:rPr>
+        <w:t xml:space="preserve">. The estimates are based on the measurements of surface and bottom interface temporal evolution from two acoustic sounders together with manual measurements of the initial ice and snow thickness. </w:t>
       </w:r>
       <w:r>
         <w:rPr>
@@ -251,6 +457,42 @@
           <w:rFonts w:ascii="Atkinson Hyperlegible" w:hAnsi="Atkinson Hyperlegible"/>
         </w:rPr>
         <w:t xml:space="preserve"> buoys with substantial differences between snow thickness estimates from acoustic sounders and thermistors.</w:t>
+      </w:r>
+      <w:r>
+        <w:rPr>
+          <w:rFonts w:ascii="Atkinson Hyperlegible" w:hAnsi="Atkinson Hyperlegible"/>
+        </w:rPr>
+        <w:t xml:space="preserve"> Additional buoys deployed in </w:t>
+      </w:r>
+      <w:r>
+        <w:rPr>
+          <w:rFonts w:ascii="Atkinson Hyperlegible" w:hAnsi="Atkinson Hyperlegible"/>
+        </w:rPr>
+        <w:t>2019</w:t>
+      </w:r>
+      <w:r>
+        <w:rPr>
+          <w:rFonts w:ascii="Atkinson Hyperlegible" w:hAnsi="Atkinson Hyperlegible"/>
+        </w:rPr>
+        <w:t>–</w:t>
+      </w:r>
+      <w:r>
+        <w:rPr>
+          <w:rFonts w:ascii="Atkinson Hyperlegible" w:hAnsi="Atkinson Hyperlegible"/>
+        </w:rPr>
+        <w:t>2024</w:t>
+      </w:r>
+      <w:r>
+        <w:rPr>
+          <w:rFonts w:ascii="Atkinson Hyperlegible" w:hAnsi="Atkinson Hyperlegible"/>
+        </w:rPr>
+        <w:t xml:space="preserve"> are listed in group (4).</w:t>
+      </w:r>
+      <w:r>
+        <w:rPr>
+          <w:rFonts w:ascii="Atkinson Hyperlegible" w:hAnsi="Atkinson Hyperlegible"/>
+        </w:rPr>
+        <w:t xml:space="preserve"> Only buoys with data over 30 days within drifting ice were processed here.</w:t>
       </w:r>
     </w:p>
     <w:tbl>
@@ -701,6 +943,7 @@
               <w:rPr>
                 <w:rFonts w:ascii="Atkinson Hyperlegible" w:hAnsi="Atkinson Hyperlegible"/>
               </w:rPr>
+              <w:lastRenderedPageBreak/>
               <w:t>2011I</w:t>
             </w:r>
             <w:r>
@@ -866,6 +1109,7 @@
               <w:rPr>
                 <w:rFonts w:ascii="Atkinson Hyperlegible" w:hAnsi="Atkinson Hyperlegible"/>
               </w:rPr>
+              <w:lastRenderedPageBreak/>
               <w:t>2. Comparable estimates of snow and ice thicknesses from acoustic sounders (West, 2020) and from temperature</w:t>
             </w:r>
           </w:p>
@@ -1248,7 +1492,6 @@
               <w:rPr>
                 <w:rFonts w:ascii="Atkinson Hyperlegible" w:hAnsi="Atkinson Hyperlegible"/>
               </w:rPr>
-              <w:lastRenderedPageBreak/>
               <w:t>3. Temperature measurements do not allow to estimate snow and ice thicknesses</w:t>
             </w:r>
           </w:p>
@@ -1615,6 +1858,376 @@
           </w:p>
         </w:tc>
       </w:tr>
+      <w:tr>
+        <w:tc>
+          <w:tcPr>
+            <w:tcW w:w="3325" w:type="dxa"/>
+          </w:tcPr>
+          <w:p>
+            <w:pPr>
+              <w:jc w:val="both"/>
+              <w:rPr>
+                <w:rFonts w:ascii="Atkinson Hyperlegible" w:hAnsi="Atkinson Hyperlegible"/>
+              </w:rPr>
+            </w:pPr>
+            <w:r>
+              <w:rPr>
+                <w:rFonts w:ascii="Atkinson Hyperlegible" w:hAnsi="Atkinson Hyperlegible"/>
+              </w:rPr>
+              <w:t xml:space="preserve">4. New buoys deployed </w:t>
+            </w:r>
+            <w:r>
+              <w:rPr>
+                <w:rFonts w:ascii="Atkinson Hyperlegible" w:hAnsi="Atkinson Hyperlegible"/>
+              </w:rPr>
+              <w:t>in 2019</w:t>
+            </w:r>
+            <w:r>
+              <w:rPr>
+                <w:rFonts w:ascii="Atkinson Hyperlegible" w:hAnsi="Atkinson Hyperlegible"/>
+              </w:rPr>
+              <w:t>–</w:t>
+            </w:r>
+            <w:r>
+              <w:rPr>
+                <w:rFonts w:ascii="Atkinson Hyperlegible" w:hAnsi="Atkinson Hyperlegible"/>
+              </w:rPr>
+              <w:t>2024</w:t>
+            </w:r>
+          </w:p>
+        </w:tc>
+        <w:tc>
+          <w:tcPr>
+            <w:tcW w:w="5760" w:type="dxa"/>
+          </w:tcPr>
+          <w:p>
+            <w:pPr>
+              <w:jc w:val="both"/>
+              <w:rPr>
+                <w:rFonts w:ascii="Atkinson Hyperlegible" w:hAnsi="Atkinson Hyperlegible"/>
+              </w:rPr>
+            </w:pPr>
+            <w:r>
+              <w:rPr>
+                <w:rFonts w:ascii="Atkinson Hyperlegible" w:hAnsi="Atkinson Hyperlegible"/>
+              </w:rPr>
+              <w:t>Dartmouth 2019 #1</w:t>
+            </w:r>
+            <w:r>
+              <w:rPr>
+                <w:rFonts w:ascii="Atkinson Hyperlegible" w:hAnsi="Atkinson Hyperlegible"/>
+              </w:rPr>
+              <w:t xml:space="preserve">, </w:t>
+            </w:r>
+            <w:r>
+              <w:rPr>
+                <w:rFonts w:ascii="Atkinson Hyperlegible" w:hAnsi="Atkinson Hyperlegible"/>
+              </w:rPr>
+              <w:t>Dartmouth 2021 #</w:t>
+            </w:r>
+            <w:r>
+              <w:rPr>
+                <w:rFonts w:ascii="Atkinson Hyperlegible" w:hAnsi="Atkinson Hyperlegible"/>
+              </w:rPr>
+              <w:t>2</w:t>
+            </w:r>
+            <w:r>
+              <w:rPr>
+                <w:rFonts w:ascii="Atkinson Hyperlegible" w:hAnsi="Atkinson Hyperlegible"/>
+              </w:rPr>
+              <w:t xml:space="preserve">, </w:t>
+            </w:r>
+            <w:r>
+              <w:rPr>
+                <w:rFonts w:ascii="Atkinson Hyperlegible" w:hAnsi="Atkinson Hyperlegible"/>
+              </w:rPr>
+              <w:t>Dartmouth 2021 #</w:t>
+            </w:r>
+            <w:r>
+              <w:rPr>
+                <w:rFonts w:ascii="Atkinson Hyperlegible" w:hAnsi="Atkinson Hyperlegible"/>
+              </w:rPr>
+              <w:t>3</w:t>
+            </w:r>
+            <w:r>
+              <w:rPr>
+                <w:rFonts w:ascii="Atkinson Hyperlegible" w:hAnsi="Atkinson Hyperlegible"/>
+              </w:rPr>
+              <w:t xml:space="preserve">, </w:t>
+            </w:r>
+            <w:r>
+              <w:rPr>
+                <w:rFonts w:ascii="Atkinson Hyperlegible" w:hAnsi="Atkinson Hyperlegible"/>
+              </w:rPr>
+              <w:t>Dartmouth 2021 #4</w:t>
+            </w:r>
+            <w:r>
+              <w:rPr>
+                <w:rFonts w:ascii="Atkinson Hyperlegible" w:hAnsi="Atkinson Hyperlegible"/>
+              </w:rPr>
+              <w:t xml:space="preserve">, </w:t>
+            </w:r>
+            <w:r>
+              <w:rPr>
+                <w:rFonts w:ascii="Atkinson Hyperlegible" w:hAnsi="Atkinson Hyperlegible"/>
+              </w:rPr>
+              <w:t>SIDEx 2021 #2</w:t>
+            </w:r>
+            <w:r>
+              <w:rPr>
+                <w:rFonts w:ascii="Atkinson Hyperlegible" w:hAnsi="Atkinson Hyperlegible"/>
+              </w:rPr>
+              <w:t xml:space="preserve">, </w:t>
+            </w:r>
+            <w:r>
+              <w:rPr>
+                <w:rFonts w:ascii="Atkinson Hyperlegible" w:hAnsi="Atkinson Hyperlegible"/>
+              </w:rPr>
+              <w:t>SIDEx 2021 #3</w:t>
+            </w:r>
+            <w:r>
+              <w:rPr>
+                <w:rFonts w:ascii="Atkinson Hyperlegible" w:hAnsi="Atkinson Hyperlegible"/>
+              </w:rPr>
+              <w:t xml:space="preserve">, </w:t>
+            </w:r>
+            <w:r>
+              <w:rPr>
+                <w:rFonts w:ascii="Atkinson Hyperlegible" w:hAnsi="Atkinson Hyperlegible"/>
+              </w:rPr>
+              <w:t>Dartmouth 2022 #6</w:t>
+            </w:r>
+            <w:r>
+              <w:rPr>
+                <w:rFonts w:ascii="Atkinson Hyperlegible" w:hAnsi="Atkinson Hyperlegible"/>
+              </w:rPr>
+              <w:t xml:space="preserve">, </w:t>
+            </w:r>
+            <w:r>
+              <w:rPr>
+                <w:rFonts w:ascii="Atkinson Hyperlegible" w:hAnsi="Atkinson Hyperlegible"/>
+              </w:rPr>
+              <w:t>Dartmouth 2022 #7</w:t>
+            </w:r>
+            <w:r>
+              <w:rPr>
+                <w:rFonts w:ascii="Atkinson Hyperlegible" w:hAnsi="Atkinson Hyperlegible"/>
+              </w:rPr>
+              <w:t xml:space="preserve">, </w:t>
+            </w:r>
+            <w:r>
+              <w:rPr>
+                <w:rFonts w:ascii="Atkinson Hyperlegible" w:hAnsi="Atkinson Hyperlegible"/>
+              </w:rPr>
+              <w:t>CRREL 2021 #5</w:t>
+            </w:r>
+            <w:r>
+              <w:rPr>
+                <w:rFonts w:ascii="Atkinson Hyperlegible" w:hAnsi="Atkinson Hyperlegible"/>
+              </w:rPr>
+              <w:t xml:space="preserve">, </w:t>
+            </w:r>
+            <w:r>
+              <w:rPr>
+                <w:rFonts w:ascii="Atkinson Hyperlegible" w:hAnsi="Atkinson Hyperlegible"/>
+              </w:rPr>
+              <w:t>Dartmouth 2021 #8</w:t>
+            </w:r>
+            <w:r>
+              <w:rPr>
+                <w:rFonts w:ascii="Atkinson Hyperlegible" w:hAnsi="Atkinson Hyperlegible"/>
+              </w:rPr>
+              <w:t xml:space="preserve">, </w:t>
+            </w:r>
+            <w:r>
+              <w:rPr>
+                <w:rFonts w:ascii="Atkinson Hyperlegible" w:hAnsi="Atkinson Hyperlegible"/>
+              </w:rPr>
+              <w:t>Dartmouth 2021 #9</w:t>
+            </w:r>
+            <w:r>
+              <w:rPr>
+                <w:rFonts w:ascii="Atkinson Hyperlegible" w:hAnsi="Atkinson Hyperlegible"/>
+              </w:rPr>
+              <w:t xml:space="preserve">, </w:t>
+            </w:r>
+            <w:r>
+              <w:rPr>
+                <w:rFonts w:ascii="Atkinson Hyperlegible" w:hAnsi="Atkinson Hyperlegible"/>
+              </w:rPr>
+              <w:t>Dartmouth 2021 #10</w:t>
+            </w:r>
+            <w:r>
+              <w:rPr>
+                <w:rFonts w:ascii="Atkinson Hyperlegible" w:hAnsi="Atkinson Hyperlegible"/>
+              </w:rPr>
+              <w:t xml:space="preserve">, </w:t>
+            </w:r>
+            <w:r>
+              <w:rPr>
+                <w:rFonts w:ascii="Atkinson Hyperlegible" w:hAnsi="Atkinson Hyperlegible"/>
+              </w:rPr>
+              <w:t>Dartmouth 2021 #11</w:t>
+            </w:r>
+            <w:r>
+              <w:rPr>
+                <w:rFonts w:ascii="Atkinson Hyperlegible" w:hAnsi="Atkinson Hyperlegible"/>
+              </w:rPr>
+              <w:t xml:space="preserve">, </w:t>
+            </w:r>
+            <w:r>
+              <w:rPr>
+                <w:rFonts w:ascii="Atkinson Hyperlegible" w:hAnsi="Atkinson Hyperlegible"/>
+              </w:rPr>
+              <w:t>ArcWatch SIMB3 2023E</w:t>
+            </w:r>
+            <w:r>
+              <w:rPr>
+                <w:rFonts w:ascii="Atkinson Hyperlegible" w:hAnsi="Atkinson Hyperlegible"/>
+              </w:rPr>
+              <w:t xml:space="preserve">, </w:t>
+            </w:r>
+            <w:r>
+              <w:rPr>
+                <w:rFonts w:ascii="Atkinson Hyperlegible" w:hAnsi="Atkinson Hyperlegible"/>
+              </w:rPr>
+              <w:t>ArcWatch SIMB3 2023C</w:t>
+            </w:r>
+            <w:r>
+              <w:rPr>
+                <w:rFonts w:ascii="Atkinson Hyperlegible" w:hAnsi="Atkinson Hyperlegible"/>
+              </w:rPr>
+              <w:t xml:space="preserve">, </w:t>
+            </w:r>
+            <w:r>
+              <w:rPr>
+                <w:rFonts w:ascii="Atkinson Hyperlegible" w:hAnsi="Atkinson Hyperlegible"/>
+              </w:rPr>
+              <w:t>ArcWatch SIMB3 2023D. SIMB3 2024B</w:t>
+            </w:r>
+            <w:r>
+              <w:rPr>
+                <w:rFonts w:ascii="Atkinson Hyperlegible" w:hAnsi="Atkinson Hyperlegible"/>
+              </w:rPr>
+              <w:t xml:space="preserve">, </w:t>
+            </w:r>
+            <w:r>
+              <w:rPr>
+                <w:rFonts w:ascii="Atkinson Hyperlegible" w:hAnsi="Atkinson Hyperlegible"/>
+              </w:rPr>
+              <w:t>SIMB3 2024D</w:t>
+            </w:r>
+            <w:r>
+              <w:rPr>
+                <w:rFonts w:ascii="Atkinson Hyperlegible" w:hAnsi="Atkinson Hyperlegible"/>
+              </w:rPr>
+              <w:t xml:space="preserve">, </w:t>
+            </w:r>
+            <w:r>
+              <w:rPr>
+                <w:rFonts w:ascii="Atkinson Hyperlegible" w:hAnsi="Atkinson Hyperlegible"/>
+              </w:rPr>
+              <w:t>SIMB3 2024E</w:t>
+            </w:r>
+            <w:r>
+              <w:rPr>
+                <w:rFonts w:ascii="Atkinson Hyperlegible" w:hAnsi="Atkinson Hyperlegible"/>
+              </w:rPr>
+              <w:t xml:space="preserve">, </w:t>
+            </w:r>
+            <w:r>
+              <w:rPr>
+                <w:rFonts w:ascii="Atkinson Hyperlegible" w:hAnsi="Atkinson Hyperlegible"/>
+              </w:rPr>
+              <w:t>SIMB3 2024F</w:t>
+            </w:r>
+            <w:r>
+              <w:rPr>
+                <w:rFonts w:ascii="Atkinson Hyperlegible" w:hAnsi="Atkinson Hyperlegible"/>
+              </w:rPr>
+              <w:t xml:space="preserve">, </w:t>
+            </w:r>
+            <w:r>
+              <w:rPr>
+                <w:rFonts w:ascii="Atkinson Hyperlegible" w:hAnsi="Atkinson Hyperlegible"/>
+              </w:rPr>
+              <w:t>SIMB3 2024G</w:t>
+            </w:r>
+            <w:r>
+              <w:rPr>
+                <w:rFonts w:ascii="Atkinson Hyperlegible" w:hAnsi="Atkinson Hyperlegible"/>
+              </w:rPr>
+              <w:t xml:space="preserve">, </w:t>
+            </w:r>
+            <w:r>
+              <w:rPr>
+                <w:rFonts w:ascii="Atkinson Hyperlegible" w:hAnsi="Atkinson Hyperlegible"/>
+              </w:rPr>
+              <w:t>SIMB3 2024H</w:t>
+            </w:r>
+            <w:r>
+              <w:rPr>
+                <w:rFonts w:ascii="Atkinson Hyperlegible" w:hAnsi="Atkinson Hyperlegible"/>
+              </w:rPr>
+              <w:t xml:space="preserve">, </w:t>
+            </w:r>
+            <w:r>
+              <w:rPr>
+                <w:rFonts w:ascii="Atkinson Hyperlegible" w:hAnsi="Atkinson Hyperlegible"/>
+              </w:rPr>
+              <w:t>SIMB3 2024I</w:t>
+            </w:r>
+            <w:r>
+              <w:rPr>
+                <w:rFonts w:ascii="Atkinson Hyperlegible" w:hAnsi="Atkinson Hyperlegible"/>
+              </w:rPr>
+              <w:t xml:space="preserve">, </w:t>
+            </w:r>
+            <w:r>
+              <w:rPr>
+                <w:rFonts w:ascii="Atkinson Hyperlegible" w:hAnsi="Atkinson Hyperlegible"/>
+              </w:rPr>
+              <w:t>SIMB3 2024R</w:t>
+            </w:r>
+            <w:r>
+              <w:rPr>
+                <w:rFonts w:ascii="Atkinson Hyperlegible" w:hAnsi="Atkinson Hyperlegible"/>
+              </w:rPr>
+              <w:t xml:space="preserve">, </w:t>
+            </w:r>
+            <w:r>
+              <w:rPr>
+                <w:rFonts w:ascii="Atkinson Hyperlegible" w:hAnsi="Atkinson Hyperlegible"/>
+              </w:rPr>
+              <w:t>SIMB3 2024S</w:t>
+            </w:r>
+            <w:r>
+              <w:rPr>
+                <w:rFonts w:ascii="Atkinson Hyperlegible" w:hAnsi="Atkinson Hyperlegible"/>
+              </w:rPr>
+              <w:t>,</w:t>
+            </w:r>
+            <w:r>
+              <w:rPr>
+                <w:rFonts w:ascii="Atkinson Hyperlegible" w:hAnsi="Atkinson Hyperlegible"/>
+              </w:rPr>
+              <w:t xml:space="preserve"> SIMB3 2024U</w:t>
+            </w:r>
+            <w:r>
+              <w:rPr>
+                <w:rFonts w:ascii="Atkinson Hyperlegible" w:hAnsi="Atkinson Hyperlegible"/>
+              </w:rPr>
+              <w:t xml:space="preserve">, </w:t>
+            </w:r>
+            <w:r>
+              <w:rPr>
+                <w:rFonts w:ascii="Atkinson Hyperlegible" w:hAnsi="Atkinson Hyperlegible"/>
+              </w:rPr>
+              <w:t>SIMB3 2024W</w:t>
+            </w:r>
+          </w:p>
+        </w:tc>
+      </w:tr>
     </w:tbl>
     <w:p>
       <w:pPr>
@@ -1685,19 +2298,7 @@
         <w:rPr>
           <w:rFonts w:ascii="Atkinson Hyperlegible" w:hAnsi="Atkinson Hyperlegible"/>
         </w:rPr>
-        <w:t xml:space="preserve">After preliminary identification of interfaces, the interface estimates from </w:t>
-      </w:r>
-      <w:r>
-        <w:rPr>
-          <w:rFonts w:ascii="Atkinson Hyperlegible" w:hAnsi="Atkinson Hyperlegible"/>
-        </w:rPr>
-        <w:t>acoustic sounders</w:t>
-      </w:r>
-      <w:r>
-        <w:rPr>
-          <w:rFonts w:ascii="Atkinson Hyperlegible" w:hAnsi="Atkinson Hyperlegible"/>
-        </w:rPr>
-        <w:t xml:space="preserve"> from West (2020) are adjusted by a constant value to fit the temperature-based interfaces for the time close to buoy deployment.</w:t>
+        <w:t>After preliminary identification of interfaces, the interface estimates from acoustic sounders from West (2020) are adjusted by a constant value to fit the temperature-based interfaces for the time close to buoy deployment.</w:t>
       </w:r>
     </w:p>
     <w:p>
@@ -1716,25 +2317,25 @@
         <w:rPr>
           <w:rFonts w:ascii="Atkinson Hyperlegible" w:hAnsi="Atkinson Hyperlegible"/>
         </w:rPr>
-        <w:t xml:space="preserve">If estimates from temperature and from </w:t>
-      </w:r>
-      <w:r>
-        <w:rPr>
-          <w:rFonts w:ascii="Atkinson Hyperlegible" w:hAnsi="Atkinson Hyperlegible"/>
-        </w:rPr>
-        <w:t>acoustic sounders</w:t>
-      </w:r>
-      <w:r>
-        <w:rPr>
-          <w:rFonts w:ascii="Atkinson Hyperlegible" w:hAnsi="Atkinson Hyperlegible"/>
-        </w:rPr>
-        <w:t xml:space="preserve"> are within </w:t>
-      </w:r>
-      <w:r>
-        <w:rPr>
-          <w:rFonts w:ascii="Atkinson Hyperlegible" w:hAnsi="Atkinson Hyperlegible"/>
-        </w:rPr>
-        <w:t>the thermistor spacing (0.1 m), the estimates are not further processed.</w:t>
+        <w:t xml:space="preserve">If estimates from temperature and from acoustic sounders are within </w:t>
+      </w:r>
+      <w:r>
+        <w:rPr>
+          <w:rFonts w:ascii="Atkinson Hyperlegible" w:hAnsi="Atkinson Hyperlegible"/>
+        </w:rPr>
+        <w:t>the thermistor spacing (0.1 m</w:t>
+      </w:r>
+      <w:r>
+        <w:rPr>
+          <w:rFonts w:ascii="Atkinson Hyperlegible" w:hAnsi="Atkinson Hyperlegible"/>
+        </w:rPr>
+        <w:t xml:space="preserve"> or 0.02 m</w:t>
+      </w:r>
+      <w:r>
+        <w:rPr>
+          <w:rFonts w:ascii="Atkinson Hyperlegible" w:hAnsi="Atkinson Hyperlegible"/>
+        </w:rPr>
+        <w:t>), the estimates are not further processed.</w:t>
       </w:r>
     </w:p>
     <w:p>
@@ -1767,7 +2368,62 @@
         <w:rPr>
           <w:rFonts w:ascii="Atkinson Hyperlegible" w:hAnsi="Atkinson Hyperlegible"/>
         </w:rPr>
+        <w:lastRenderedPageBreak/>
         <w:t>The updated version of the interface and thickness estimates is published in the same format as in West (2020) with both original and updated values.</w:t>
+      </w:r>
+      <w:r>
+        <w:rPr>
+          <w:rFonts w:ascii="Atkinson Hyperlegible" w:hAnsi="Atkinson Hyperlegible"/>
+        </w:rPr>
+        <w:t xml:space="preserve"> The raw data from SIMB3 buoys deployed </w:t>
+      </w:r>
+      <w:r>
+        <w:rPr>
+          <w:rFonts w:ascii="Atkinson Hyperlegible" w:hAnsi="Atkinson Hyperlegible"/>
+        </w:rPr>
+        <w:t>in 2019</w:t>
+      </w:r>
+      <w:r>
+        <w:rPr>
+          <w:rFonts w:ascii="Atkinson Hyperlegible" w:hAnsi="Atkinson Hyperlegible"/>
+        </w:rPr>
+        <w:t>–</w:t>
+      </w:r>
+      <w:r>
+        <w:rPr>
+          <w:rFonts w:ascii="Atkinson Hyperlegible" w:hAnsi="Atkinson Hyperlegible"/>
+        </w:rPr>
+        <w:t>2024</w:t>
+      </w:r>
+      <w:r>
+        <w:rPr>
+          <w:rFonts w:ascii="Atkinson Hyperlegible" w:hAnsi="Atkinson Hyperlegible"/>
+        </w:rPr>
+        <w:t xml:space="preserve"> was processed and published identically to IMB buoys deployed in </w:t>
+      </w:r>
+      <w:r>
+        <w:rPr>
+          <w:rFonts w:ascii="Atkinson Hyperlegible" w:hAnsi="Atkinson Hyperlegible"/>
+        </w:rPr>
+        <w:t>1997</w:t>
+      </w:r>
+      <w:r>
+        <w:rPr>
+          <w:rFonts w:ascii="Atkinson Hyperlegible" w:hAnsi="Atkinson Hyperlegible"/>
+        </w:rPr>
+        <w:t>–</w:t>
+      </w:r>
+      <w:r>
+        <w:rPr>
+          <w:rFonts w:ascii="Atkinson Hyperlegible" w:hAnsi="Atkinson Hyperlegible"/>
+        </w:rPr>
+        <w:t>2015</w:t>
+      </w:r>
+      <w:r>
+        <w:rPr>
+          <w:rFonts w:ascii="Atkinson Hyperlegible" w:hAnsi="Atkinson Hyperlegible"/>
+        </w:rPr>
+        <w:t>.</w:t>
       </w:r>
     </w:p>
     <w:p>
@@ -1817,6 +2473,7 @@
       <w:r>
         <w:rPr>
           <w:rFonts w:ascii="Atkinson Hyperlegible" w:hAnsi="Atkinson Hyperlegible"/>
+          <w:noProof/>
         </w:rPr>
         <w:drawing>
           <wp:inline distT="0" distB="0" distL="0" distR="0" wp14:anchorId="0604D8AD" wp14:editId="3E542BAB">
@@ -1831,68 +2488,6 @@
                 <pic:pic xmlns:pic="http://schemas.openxmlformats.org/drawingml/2006/picture">
                   <pic:nvPicPr>
                     <pic:cNvPr id="481483824" name="Picture 8" descr="A graph of the temperature of a temperature&#10;&#10;AI-generated content may be incorrect."/>
-                    <pic:cNvPicPr>
-                      <a:picLocks noChangeAspect="1" noChangeArrowheads="1"/>
-                    </pic:cNvPicPr>
-                  </pic:nvPicPr>
-                  <pic:blipFill>
-                    <a:blip r:embed="rId6" cstate="print">
-                      <a:extLst>
-                        <a:ext uri="{28A0092B-C50C-407E-A947-70E740481C1C}">
-                          <a14:useLocalDpi xmlns:a14="http://schemas.microsoft.com/office/drawing/2010/main" val="0"/>
-                        </a:ext>
-                      </a:extLst>
-                    </a:blip>
-                    <a:srcRect/>
-                    <a:stretch>
-                      <a:fillRect/>
-                    </a:stretch>
-                  </pic:blipFill>
-                  <pic:spPr bwMode="auto">
-                    <a:xfrm>
-                      <a:off x="0" y="0"/>
-                      <a:ext cx="2834640" cy="2011822"/>
-                    </a:xfrm>
-                    <a:prstGeom prst="rect">
-                      <a:avLst/>
-                    </a:prstGeom>
-                    <a:noFill/>
-                    <a:ln>
-                      <a:noFill/>
-                    </a:ln>
-                  </pic:spPr>
-                </pic:pic>
-              </a:graphicData>
-            </a:graphic>
-          </wp:inline>
-        </w:drawing>
-      </w:r>
-      <w:r>
-        <w:rPr>
-          <w:rFonts w:ascii="Times New Roman" w:eastAsia="Times New Roman" w:hAnsi="Times New Roman" w:cs="Times New Roman"/>
-          <w:sz w:val="24"/>
-          <w:szCs w:val="24"/>
-          <w:lang w:eastAsia="en-GB"/>
-        </w:rPr>
-        <w:t xml:space="preserve"> </w:t>
-      </w:r>
-      <w:r>
-        <w:rPr>
-          <w:rFonts w:ascii="Atkinson Hyperlegible" w:hAnsi="Atkinson Hyperlegible"/>
-        </w:rPr>
-        <w:drawing>
-          <wp:inline distT="0" distB="0" distL="0" distR="0" wp14:anchorId="1E106E9F" wp14:editId="567AAE91">
-            <wp:extent cx="2834640" cy="2011822"/>
-            <wp:effectExtent l="0" t="0" r="3810" b="7620"/>
-            <wp:docPr id="758536739" name="Picture 6" descr="A graph showing the temperature of a year&#10;&#10;AI-generated content may be incorrect."/>
-            <wp:cNvGraphicFramePr>
-              <a:graphicFrameLocks xmlns:a="http://schemas.openxmlformats.org/drawingml/2006/main" noChangeAspect="1"/>
-            </wp:cNvGraphicFramePr>
-            <a:graphic xmlns:a="http://schemas.openxmlformats.org/drawingml/2006/main">
-              <a:graphicData uri="http://schemas.openxmlformats.org/drawingml/2006/picture">
-                <pic:pic xmlns:pic="http://schemas.openxmlformats.org/drawingml/2006/picture">
-                  <pic:nvPicPr>
-                    <pic:cNvPr id="758536739" name="Picture 6" descr="A graph showing the temperature of a year&#10;&#10;AI-generated content may be incorrect."/>
                     <pic:cNvPicPr>
                       <a:picLocks noChangeAspect="1" noChangeArrowheads="1"/>
                     </pic:cNvPicPr>
@@ -1929,6 +2524,69 @@
           </wp:inline>
         </w:drawing>
       </w:r>
+      <w:r>
+        <w:rPr>
+          <w:rFonts w:ascii="Times New Roman" w:eastAsia="Times New Roman" w:hAnsi="Times New Roman" w:cs="Times New Roman"/>
+          <w:sz w:val="24"/>
+          <w:szCs w:val="24"/>
+          <w:lang w:eastAsia="en-GB"/>
+        </w:rPr>
+        <w:t xml:space="preserve"> </w:t>
+      </w:r>
+      <w:r>
+        <w:rPr>
+          <w:rFonts w:ascii="Atkinson Hyperlegible" w:hAnsi="Atkinson Hyperlegible"/>
+          <w:noProof/>
+        </w:rPr>
+        <w:drawing>
+          <wp:inline distT="0" distB="0" distL="0" distR="0" wp14:anchorId="1E106E9F" wp14:editId="567AAE91">
+            <wp:extent cx="2834640" cy="2011822"/>
+            <wp:effectExtent l="0" t="0" r="3810" b="7620"/>
+            <wp:docPr id="758536739" name="Picture 6" descr="A graph showing the temperature of a year&#10;&#10;AI-generated content may be incorrect."/>
+            <wp:cNvGraphicFramePr>
+              <a:graphicFrameLocks xmlns:a="http://schemas.openxmlformats.org/drawingml/2006/main" noChangeAspect="1"/>
+            </wp:cNvGraphicFramePr>
+            <a:graphic xmlns:a="http://schemas.openxmlformats.org/drawingml/2006/main">
+              <a:graphicData uri="http://schemas.openxmlformats.org/drawingml/2006/picture">
+                <pic:pic xmlns:pic="http://schemas.openxmlformats.org/drawingml/2006/picture">
+                  <pic:nvPicPr>
+                    <pic:cNvPr id="758536739" name="Picture 6" descr="A graph showing the temperature of a year&#10;&#10;AI-generated content may be incorrect."/>
+                    <pic:cNvPicPr>
+                      <a:picLocks noChangeAspect="1" noChangeArrowheads="1"/>
+                    </pic:cNvPicPr>
+                  </pic:nvPicPr>
+                  <pic:blipFill>
+                    <a:blip r:embed="rId8" cstate="print">
+                      <a:extLst>
+                        <a:ext uri="{28A0092B-C50C-407E-A947-70E740481C1C}">
+                          <a14:useLocalDpi xmlns:a14="http://schemas.microsoft.com/office/drawing/2010/main" val="0"/>
+                        </a:ext>
+                      </a:extLst>
+                    </a:blip>
+                    <a:srcRect/>
+                    <a:stretch>
+                      <a:fillRect/>
+                    </a:stretch>
+                  </pic:blipFill>
+                  <pic:spPr bwMode="auto">
+                    <a:xfrm>
+                      <a:off x="0" y="0"/>
+                      <a:ext cx="2834640" cy="2011822"/>
+                    </a:xfrm>
+                    <a:prstGeom prst="rect">
+                      <a:avLst/>
+                    </a:prstGeom>
+                    <a:noFill/>
+                    <a:ln>
+                      <a:noFill/>
+                    </a:ln>
+                  </pic:spPr>
+                </pic:pic>
+              </a:graphicData>
+            </a:graphic>
+          </wp:inline>
+        </w:drawing>
+      </w:r>
     </w:p>
     <w:p>
       <w:pPr>
@@ -1947,7 +2605,6 @@
           <w:szCs w:val="24"/>
           <w:lang w:eastAsia="en-GB"/>
         </w:rPr>
-        <w:lastRenderedPageBreak/>
         <w:t xml:space="preserve">Figure 1. </w:t>
       </w:r>
       <w:r>
@@ -2071,6 +2728,7 @@
       <w:r>
         <w:rPr>
           <w:rFonts w:ascii="Atkinson Hyperlegible" w:hAnsi="Atkinson Hyperlegible"/>
+          <w:noProof/>
         </w:rPr>
         <w:drawing>
           <wp:inline distT="0" distB="0" distL="0" distR="0" wp14:anchorId="7B9E5C6F" wp14:editId="3CAC1B25">
@@ -2090,7 +2748,7 @@
                     </pic:cNvPicPr>
                   </pic:nvPicPr>
                   <pic:blipFill>
-                    <a:blip r:embed="rId8" cstate="print">
+                    <a:blip r:embed="rId9" cstate="print">
                       <a:extLst>
                         <a:ext uri="{28A0092B-C50C-407E-A947-70E740481C1C}">
                           <a14:useLocalDpi xmlns:a14="http://schemas.microsoft.com/office/drawing/2010/main" val="0"/>
@@ -2223,6 +2881,7 @@
           <w:rFonts w:ascii="Atkinson Hyperlegible" w:hAnsi="Atkinson Hyperlegible"/>
           <w:b/>
         </w:rPr>
+        <w:lastRenderedPageBreak/>
         <w:t>The dataset</w:t>
       </w:r>
     </w:p>
@@ -2243,21 +2902,7 @@
         <w:rPr>
           <w:rFonts w:ascii="Atkinson Hyperlegible" w:hAnsi="Atkinson Hyperlegible"/>
         </w:rPr>
-        <w:t>github.com/</w:t>
-      </w:r>
-      <w:proofErr w:type="spellStart"/>
-      <w:r>
-        <w:rPr>
-          <w:rFonts w:ascii="Atkinson Hyperlegible" w:hAnsi="Atkinson Hyperlegible"/>
-        </w:rPr>
-        <w:t>esalganik</w:t>
-      </w:r>
-      <w:proofErr w:type="spellEnd"/>
-      <w:r>
-        <w:rPr>
-          <w:rFonts w:ascii="Atkinson Hyperlegible" w:hAnsi="Atkinson Hyperlegible"/>
-        </w:rPr>
-        <w:t>/SIMB3</w:t>
+        <w:t>github.com/esalganik/SIMB3</w:t>
       </w:r>
       <w:r>
         <w:rPr>
@@ -4572,6 +5217,7 @@
   <w:style w:type="character" w:default="1" w:styleId="DefaultParagraphFont">
     <w:name w:val="Default Paragraph Font"/>
     <w:uiPriority w:val="1"/>
+    <w:semiHidden/>
     <w:unhideWhenUsed/>
   </w:style>
   <w:style w:type="table" w:default="1" w:styleId="TableNormal">

</xml_diff>